<commit_message>
exported oracle as new skill
</commit_message>
<xml_diff>
--- a/docs/phase1/dbmigrate/export-oracle/MigrationExportReport.docx
+++ b/docs/phase1/dbmigrate/export-oracle/MigrationExportReport.docx
@@ -78,7 +78,7 @@
                 <w:sz w:val="24"/>
                 <w:szCs w:val="24"/>
               </w:rPr>
-              <w:t xml:space="preserve">8 tables  |  155 rows  |  credentials sanitized for 12 users  |  Oracle AI Database 26ai (version 23+)</w:t>
+              <w:t xml:space="preserve">8 tables  |  156 rows  |  credentials sanitized for 12 users  |  Oracle AI Database 26ai (version 23+)</w:t>
             </w:r>
           </w:p>
         </w:tc>
@@ -94,7 +94,7 @@
         <w:spacing w:after="40"/>
       </w:pPr>
       <w:r>
-        <w:t xml:space="preserve">Run date (UTC): 2026-09-24 13:50:17</w:t>
+        <w:t xml:space="preserve">Run date (UTC): 2026-09-30 08:36:58</w:t>
       </w:r>
     </w:p>
     <w:p>
@@ -118,7 +118,7 @@
         <w:spacing w:after="240"/>
       </w:pPr>
       <w:r>
-        <w:t xml:space="preserve">Tooling version: git commit e044682</w:t>
+        <w:t xml:space="preserve">Tooling version: git commit 7b2b1fa</w:t>
       </w:r>
     </w:p>
     <w:p>
@@ -226,7 +226,7 @@
     </w:p>
     <w:p>
       <w:r>
-        <w:t xml:space="preserve">The MasterAntiqueRepair SQL Server database was exported into Oracle-specific files: a schema file (01-schema.sql), a data file (02-data-sanitized.sql) and a metadata file (source-metadata.json) describing the source. All 155 rows across 8 tables were exported. Password hashes and security stamps were blanked before anything was written, so no credential exists in any output file.</w:t>
+        <w:t xml:space="preserve">The MasterAntiqueRepair SQL Server database was exported into Oracle-specific files: a schema file (01-schema.sql), a data file (02-data-sanitized.sql) and a metadata file (source-metadata.json) describing the source. All 156 rows across 8 tables were exported. Password hashes and security stamps were blanked before anything was written, so no credential exists in any output file.</w:t>
       </w:r>
     </w:p>
     <w:p>
@@ -402,7 +402,7 @@
               <w:pStyle w:val="TableText"/>
             </w:pPr>
             <w:r>
-              <w:t xml:space="preserve">155</w:t>
+              <w:t xml:space="preserve">156</w:t>
             </w:r>
           </w:p>
         </w:tc>
@@ -998,7 +998,7 @@
               <w:pStyle w:val="TableText"/>
             </w:pPr>
             <w:r>
-              <w:t xml:space="preserve">78</w:t>
+              <w:t xml:space="preserve">79</w:t>
             </w:r>
           </w:p>
         </w:tc>
@@ -1012,7 +1012,7 @@
               <w:pStyle w:val="TableText"/>
             </w:pPr>
             <w:r>
-              <w:t xml:space="preserve">78</w:t>
+              <w:t xml:space="preserve">79</w:t>
             </w:r>
           </w:p>
         </w:tc>
@@ -1026,7 +1026,7 @@
               <w:pStyle w:val="TableText"/>
             </w:pPr>
             <w:r>
-              <w:t xml:space="preserve">c6e4f24be7acad70</w:t>
+              <w:t xml:space="preserve">812ce44474626ebe</w:t>
             </w:r>
           </w:p>
         </w:tc>
@@ -8097,7 +8097,7 @@
               <w:pStyle w:val="TableText"/>
             </w:pPr>
             <w:r>
-              <w:t xml:space="preserve">0 = 11; 1 = 1; 2 = 24; 3 = 16; ...</w:t>
+              <w:t xml:space="preserve">0 = 11; 1 = 2; 2 = 24; 3 = 16; ...</w:t>
             </w:r>
           </w:p>
         </w:tc>
@@ -8229,7 +8229,7 @@
               <w:pStyle w:val="TableText"/>
             </w:pPr>
             <w:r>
-              <w:t xml:space="preserve">2026-09-10 14:41:58 | 2026-09-11 16:41:58 | 2026-09-07 08:20:34 | 2026-09-17 14:43:56</w:t>
+              <w:t xml:space="preserve">2026-09-10 14:41:58 | 2026-09-11 16:41:58 | 2026-09-07 08:20:34 | 2026-09-30 03:07:32</w:t>
             </w:r>
           </w:p>
         </w:tc>
@@ -8677,7 +8677,7 @@
               <w:pStyle w:val="TableText"/>
             </w:pPr>
             <w:r>
-              <w:t xml:space="preserve">e044682</w:t>
+              <w:t xml:space="preserve">7b2b1fa</w:t>
             </w:r>
           </w:p>
         </w:tc>
@@ -8743,7 +8743,7 @@
               <w:pStyle w:val="TableText"/>
             </w:pPr>
             <w:r>
-              <w:t xml:space="preserve">2026-09-24 13:50:17</w:t>
+              <w:t xml:space="preserve">2026-09-30 08:36:58</w:t>
             </w:r>
           </w:p>
         </w:tc>
@@ -8809,7 +8809,7 @@
               <w:pStyle w:val="TableText"/>
             </w:pPr>
             <w:r>
-              <w:t xml:space="preserve">0c1504e711c113d91b40edfd20fd10429fe1d6a4a29378fb7df908964654d08e</w:t>
+              <w:t xml:space="preserve">64602aebd2351b79889890b0ae4f9c429bc2018ac4c04654e2349ff1e6d62578</w:t>
             </w:r>
           </w:p>
         </w:tc>
@@ -9052,7 +9052,7 @@
               <w:pStyle w:val="TableText"/>
             </w:pPr>
             <w:r>
-              <w:t xml:space="preserve">78</w:t>
+              <w:t xml:space="preserve">79</w:t>
             </w:r>
           </w:p>
         </w:tc>
@@ -9066,9 +9066,9 @@
               <w:pStyle w:val="TableText"/>
             </w:pPr>
             <w:r>
-              <w:t xml:space="preserve">c6e4f24be7acad70339ca42dc69160f6</w:t>
+              <w:t xml:space="preserve">812ce44474626ebe36093b66246f9410</w:t>
               <w:br/>
-              <w:t xml:space="preserve">75b3f42f0fab54f4c4be0be53c118e4d</w:t>
+              <w:t xml:space="preserve">72c87b0dbdcf7d4d4325be32a0fc4423</w:t>
             </w:r>
           </w:p>
         </w:tc>
@@ -9342,7 +9342,7 @@
       <w:jc w:val="center"/>
     </w:pPr>
     <w:r>
-      <w:t xml:space="preserve">Commit e044682 | 2026-09-24 13:50:17 UTC   |   Page </w:t>
+      <w:t xml:space="preserve">Commit 7b2b1fa | 2026-09-30 08:36:58 UTC   |   Page </w:t>
     </w:r>
     <w:r>
       <w:fldChar w:fldCharType="begin"/>

</xml_diff>